<commit_message>
feat: Update Assignment 3 report and add Assignment 6 CNN implementation
</commit_message>
<xml_diff>
--- a/Ass3/60_Assignment-3_DL.docx
+++ b/Ass3/60_Assignment-3_DL.docx
@@ -181,23 +181,7 @@
           <w:u w:val="single"/>
           <w:lang w:val="en" w:eastAsia="en-IN"/>
         </w:rPr>
-        <w:t xml:space="preserve">Practical No: </w:t>
-      </w:r>
-      <w:r>
-        <w:rPr>
-          <w:rFonts w:ascii="Arial" w:eastAsia="Arial" w:hAnsi="Arial" w:cs="Arial"/>
-          <w:u w:val="single"/>
-          <w:lang w:val="en" w:eastAsia="en-IN"/>
-        </w:rPr>
-        <w:t>3</w:t>
-      </w:r>
-      <w:r>
-        <w:rPr>
-          <w:rFonts w:ascii="Arial" w:eastAsia="Arial" w:hAnsi="Arial" w:cs="Arial"/>
-          <w:u w:val="single"/>
-          <w:lang w:val="en" w:eastAsia="en-IN"/>
-        </w:rPr>
-        <w:t xml:space="preserve"> </w:t>
+        <w:t xml:space="preserve">Practical No: 3 </w:t>
       </w:r>
       <w:r>
         <w:rPr>
@@ -237,21 +221,7 @@
           <w:rFonts w:ascii="Arial" w:eastAsia="Arial" w:hAnsi="Arial" w:cs="Arial"/>
           <w:lang w:val="en" w:eastAsia="en-IN"/>
         </w:rPr>
-        <w:t xml:space="preserve"> </w:t>
-      </w:r>
-      <w:r>
-        <w:rPr>
-          <w:rFonts w:ascii="Arial" w:eastAsia="Arial" w:hAnsi="Arial" w:cs="Arial"/>
-          <w:lang w:val="en" w:eastAsia="en-IN"/>
-        </w:rPr>
-        <w:t>60</w:t>
-      </w:r>
-      <w:r>
-        <w:rPr>
-          <w:rFonts w:ascii="Arial" w:eastAsia="Arial" w:hAnsi="Arial" w:cs="Arial"/>
-          <w:lang w:val="en" w:eastAsia="en-IN"/>
-        </w:rPr>
-        <w:t xml:space="preserve">       </w:t>
+        <w:t xml:space="preserve"> 60       </w:t>
       </w:r>
       <w:r>
         <w:rPr>
@@ -259,15 +229,7 @@
           <w:u w:val="single"/>
           <w:lang w:val="en" w:eastAsia="en-IN"/>
         </w:rPr>
-        <w:t>PRN No: 1241</w:t>
-      </w:r>
-      <w:r>
-        <w:rPr>
-          <w:rFonts w:ascii="Arial" w:eastAsia="Arial" w:hAnsi="Arial" w:cs="Arial"/>
-          <w:u w:val="single"/>
-          <w:lang w:val="en" w:eastAsia="en-IN"/>
-        </w:rPr>
-        <w:t>4029</w:t>
+        <w:t>PRN No: 12414029</w:t>
       </w:r>
       <w:r>
         <w:rPr>
@@ -323,29 +285,7 @@
           <w:u w:val="single"/>
           <w:lang w:val="en" w:eastAsia="en-IN"/>
         </w:rPr>
-        <w:t xml:space="preserve">Subject </w:t>
-      </w:r>
-      <w:proofErr w:type="gramStart"/>
-      <w:r>
-        <w:rPr>
-          <w:rFonts w:ascii="Arial" w:eastAsia="Arial" w:hAnsi="Arial" w:cs="Arial"/>
-          <w:b/>
-          <w:bCs/>
-          <w:u w:val="single"/>
-          <w:lang w:val="en" w:eastAsia="en-IN"/>
-        </w:rPr>
-        <w:t>Name :</w:t>
-      </w:r>
-      <w:proofErr w:type="gramEnd"/>
-      <w:r>
-        <w:rPr>
-          <w:rFonts w:ascii="Arial" w:eastAsia="Arial" w:hAnsi="Arial" w:cs="Arial"/>
-          <w:b/>
-          <w:bCs/>
-          <w:u w:val="single"/>
-          <w:lang w:val="en" w:eastAsia="en-IN"/>
-        </w:rPr>
-        <w:t xml:space="preserve"> Deep Learning</w:t>
+        <w:t>Subject Name : Deep Learning</w:t>
       </w:r>
     </w:p>
     <w:p>
@@ -362,8 +302,14 @@
     <w:p>
       <w:pPr>
         <w:pStyle w:val="Heading2"/>
+        <w:rPr>
+          <w:color w:val="auto"/>
+        </w:rPr>
       </w:pPr>
       <w:r>
+        <w:rPr>
+          <w:color w:val="auto"/>
+        </w:rPr>
         <w:t>1. Course Objectives &amp; Relevance</w:t>
       </w:r>
     </w:p>
@@ -391,8 +337,14 @@
     <w:p>
       <w:pPr>
         <w:pStyle w:val="Heading2"/>
+        <w:rPr>
+          <w:color w:val="auto"/>
+        </w:rPr>
       </w:pPr>
       <w:r>
+        <w:rPr>
+          <w:color w:val="auto"/>
+        </w:rPr>
         <w:t>2. Theoretical Foundations &amp; Mathematical Equations</w:t>
       </w:r>
     </w:p>
@@ -457,8 +409,14 @@
     <w:p>
       <w:pPr>
         <w:pStyle w:val="Heading2"/>
+        <w:rPr>
+          <w:color w:val="auto"/>
+        </w:rPr>
       </w:pPr>
       <w:r>
+        <w:rPr>
+          <w:color w:val="auto"/>
+        </w:rPr>
         <w:lastRenderedPageBreak/>
         <w:t>3. Algorithm / Step-by-Step Execution Plan</w:t>
       </w:r>
@@ -515,8 +473,14 @@
     <w:p>
       <w:pPr>
         <w:pStyle w:val="Heading2"/>
+        <w:rPr>
+          <w:color w:val="auto"/>
+        </w:rPr>
       </w:pPr>
       <w:r>
+        <w:rPr>
+          <w:color w:val="auto"/>
+        </w:rPr>
         <w:t>4. Hyperparameter Analysis Summary Tables</w:t>
       </w:r>
     </w:p>
@@ -530,8 +494,8 @@
     </w:p>
     <w:tbl>
       <w:tblPr>
+        <w:tblStyle w:val="TableGrid"/>
         <w:tblW w:w="0" w:type="auto"/>
-        <w:jc w:val="center"/>
         <w:tblLook w:val="04A0" w:firstRow="1" w:lastRow="0" w:firstColumn="1" w:lastColumn="0" w:noHBand="0" w:noVBand="1"/>
       </w:tblPr>
       <w:tblGrid>
@@ -541,19 +505,14 @@
         <w:gridCol w:w="2160"/>
       </w:tblGrid>
       <w:tr>
-        <w:trPr>
-          <w:jc w:val="center"/>
-        </w:trPr>
         <w:tc>
           <w:tcPr>
             <w:tcW w:w="2160" w:type="dxa"/>
-            <w:shd w:val="clear" w:color="auto" w:fill="1F4E79"/>
           </w:tcPr>
           <w:p>
             <w:r>
               <w:rPr>
                 <w:b/>
-                <w:color w:val="FFFFFF"/>
               </w:rPr>
               <w:t>Learning Rate (eta)</w:t>
             </w:r>
@@ -562,13 +521,11 @@
         <w:tc>
           <w:tcPr>
             <w:tcW w:w="2160" w:type="dxa"/>
-            <w:shd w:val="clear" w:color="auto" w:fill="1F4E79"/>
           </w:tcPr>
           <w:p>
             <w:r>
               <w:rPr>
                 <w:b/>
-                <w:color w:val="FFFFFF"/>
               </w:rPr>
               <w:t>Loss Behavior</w:t>
             </w:r>
@@ -577,13 +534,11 @@
         <w:tc>
           <w:tcPr>
             <w:tcW w:w="2160" w:type="dxa"/>
-            <w:shd w:val="clear" w:color="auto" w:fill="1F4E79"/>
           </w:tcPr>
           <w:p>
             <w:r>
               <w:rPr>
                 <w:b/>
-                <w:color w:val="FFFFFF"/>
               </w:rPr>
               <w:t>Validation Accuracy</w:t>
             </w:r>
@@ -592,13 +547,11 @@
         <w:tc>
           <w:tcPr>
             <w:tcW w:w="2160" w:type="dxa"/>
-            <w:shd w:val="clear" w:color="auto" w:fill="1F4E79"/>
           </w:tcPr>
           <w:p>
             <w:r>
               <w:rPr>
                 <w:b/>
-                <w:color w:val="FFFFFF"/>
               </w:rPr>
               <w:t>Gradient Status &amp; Conclusion</w:t>
             </w:r>
@@ -606,13 +559,9 @@
         </w:tc>
       </w:tr>
       <w:tr>
-        <w:trPr>
-          <w:jc w:val="center"/>
-        </w:trPr>
         <w:tc>
           <w:tcPr>
             <w:tcW w:w="2160" w:type="dxa"/>
-            <w:shd w:val="clear" w:color="auto" w:fill="F2F2F2"/>
           </w:tcPr>
           <w:p>
             <w:r>
@@ -623,7 +572,6 @@
         <w:tc>
           <w:tcPr>
             <w:tcW w:w="2160" w:type="dxa"/>
-            <w:shd w:val="clear" w:color="auto" w:fill="F2F2F2"/>
           </w:tcPr>
           <w:p>
             <w:r>
@@ -634,7 +582,6 @@
         <w:tc>
           <w:tcPr>
             <w:tcW w:w="2160" w:type="dxa"/>
-            <w:shd w:val="clear" w:color="auto" w:fill="F2F2F2"/>
           </w:tcPr>
           <w:p>
             <w:r>
@@ -645,7 +592,6 @@
         <w:tc>
           <w:tcPr>
             <w:tcW w:w="2160" w:type="dxa"/>
-            <w:shd w:val="clear" w:color="auto" w:fill="F2F2F2"/>
           </w:tcPr>
           <w:p>
             <w:r>
@@ -655,9 +601,6 @@
         </w:tc>
       </w:tr>
       <w:tr>
-        <w:trPr>
-          <w:jc w:val="center"/>
-        </w:trPr>
         <w:tc>
           <w:tcPr>
             <w:tcW w:w="2160" w:type="dxa"/>
@@ -700,13 +643,9 @@
         </w:tc>
       </w:tr>
       <w:tr>
-        <w:trPr>
-          <w:jc w:val="center"/>
-        </w:trPr>
         <w:tc>
           <w:tcPr>
             <w:tcW w:w="2160" w:type="dxa"/>
-            <w:shd w:val="clear" w:color="auto" w:fill="F2F2F2"/>
           </w:tcPr>
           <w:p>
             <w:r>
@@ -717,7 +656,6 @@
         <w:tc>
           <w:tcPr>
             <w:tcW w:w="2160" w:type="dxa"/>
-            <w:shd w:val="clear" w:color="auto" w:fill="F2F2F2"/>
           </w:tcPr>
           <w:p>
             <w:r>
@@ -728,7 +666,6 @@
         <w:tc>
           <w:tcPr>
             <w:tcW w:w="2160" w:type="dxa"/>
-            <w:shd w:val="clear" w:color="auto" w:fill="F2F2F2"/>
           </w:tcPr>
           <w:p>
             <w:r>
@@ -739,7 +676,6 @@
         <w:tc>
           <w:tcPr>
             <w:tcW w:w="2160" w:type="dxa"/>
-            <w:shd w:val="clear" w:color="auto" w:fill="F2F2F2"/>
           </w:tcPr>
           <w:p>
             <w:r>
@@ -749,9 +685,6 @@
         </w:tc>
       </w:tr>
       <w:tr>
-        <w:trPr>
-          <w:jc w:val="center"/>
-        </w:trPr>
         <w:tc>
           <w:tcPr>
             <w:tcW w:w="2160" w:type="dxa"/>
@@ -809,8 +742,8 @@
     </w:p>
     <w:tbl>
       <w:tblPr>
+        <w:tblStyle w:val="TableGrid"/>
         <w:tblW w:w="0" w:type="auto"/>
-        <w:jc w:val="center"/>
         <w:tblLook w:val="04A0" w:firstRow="1" w:lastRow="0" w:firstColumn="1" w:lastColumn="0" w:noHBand="0" w:noVBand="1"/>
       </w:tblPr>
       <w:tblGrid>
@@ -820,19 +753,14 @@
         <w:gridCol w:w="2160"/>
       </w:tblGrid>
       <w:tr>
-        <w:trPr>
-          <w:jc w:val="center"/>
-        </w:trPr>
         <w:tc>
           <w:tcPr>
             <w:tcW w:w="2160" w:type="dxa"/>
-            <w:shd w:val="clear" w:color="auto" w:fill="1F4E79"/>
           </w:tcPr>
           <w:p>
             <w:r>
               <w:rPr>
                 <w:b/>
-                <w:color w:val="FFFFFF"/>
               </w:rPr>
               <w:t>Epoch Count</w:t>
             </w:r>
@@ -841,13 +769,11 @@
         <w:tc>
           <w:tcPr>
             <w:tcW w:w="2160" w:type="dxa"/>
-            <w:shd w:val="clear" w:color="auto" w:fill="1F4E79"/>
           </w:tcPr>
           <w:p>
             <w:r>
               <w:rPr>
                 <w:b/>
-                <w:color w:val="FFFFFF"/>
               </w:rPr>
               <w:t>Train Accuracy</w:t>
             </w:r>
@@ -856,13 +782,11 @@
         <w:tc>
           <w:tcPr>
             <w:tcW w:w="2160" w:type="dxa"/>
-            <w:shd w:val="clear" w:color="auto" w:fill="1F4E79"/>
           </w:tcPr>
           <w:p>
             <w:r>
               <w:rPr>
                 <w:b/>
-                <w:color w:val="FFFFFF"/>
               </w:rPr>
               <w:t>Validation Accuracy</w:t>
             </w:r>
@@ -871,13 +795,11 @@
         <w:tc>
           <w:tcPr>
             <w:tcW w:w="2160" w:type="dxa"/>
-            <w:shd w:val="clear" w:color="auto" w:fill="1F4E79"/>
           </w:tcPr>
           <w:p>
             <w:r>
               <w:rPr>
                 <w:b/>
-                <w:color w:val="FFFFFF"/>
               </w:rPr>
               <w:t>Model Training Status</w:t>
             </w:r>
@@ -885,17 +807,12 @@
         </w:tc>
       </w:tr>
       <w:tr>
-        <w:trPr>
-          <w:jc w:val="center"/>
-        </w:trPr>
         <w:tc>
           <w:tcPr>
             <w:tcW w:w="2160" w:type="dxa"/>
-            <w:shd w:val="clear" w:color="auto" w:fill="F2F2F2"/>
           </w:tcPr>
           <w:p>
             <w:r>
-              <w:lastRenderedPageBreak/>
               <w:t>10 Epochs</w:t>
             </w:r>
           </w:p>
@@ -903,7 +820,6 @@
         <w:tc>
           <w:tcPr>
             <w:tcW w:w="2160" w:type="dxa"/>
-            <w:shd w:val="clear" w:color="auto" w:fill="F2F2F2"/>
           </w:tcPr>
           <w:p>
             <w:r>
@@ -914,7 +830,6 @@
         <w:tc>
           <w:tcPr>
             <w:tcW w:w="2160" w:type="dxa"/>
-            <w:shd w:val="clear" w:color="auto" w:fill="F2F2F2"/>
           </w:tcPr>
           <w:p>
             <w:r>
@@ -925,7 +840,6 @@
         <w:tc>
           <w:tcPr>
             <w:tcW w:w="2160" w:type="dxa"/>
-            <w:shd w:val="clear" w:color="auto" w:fill="F2F2F2"/>
           </w:tcPr>
           <w:p>
             <w:r>
@@ -935,9 +849,6 @@
         </w:tc>
       </w:tr>
       <w:tr>
-        <w:trPr>
-          <w:jc w:val="center"/>
-        </w:trPr>
         <w:tc>
           <w:tcPr>
             <w:tcW w:w="2160" w:type="dxa"/>
@@ -974,22 +885,23 @@
           </w:tcPr>
           <w:p>
             <w:r>
-              <w:t>Optimal Trade-off: High accuracy with minimal validation gap.</w:t>
+              <w:t xml:space="preserve">Optimal Trade-off: High accuracy with minimal validation </w:t>
+            </w:r>
+            <w:r>
+              <w:lastRenderedPageBreak/>
+              <w:t>gap.</w:t>
             </w:r>
           </w:p>
         </w:tc>
       </w:tr>
       <w:tr>
-        <w:trPr>
-          <w:jc w:val="center"/>
-        </w:trPr>
         <w:tc>
           <w:tcPr>
             <w:tcW w:w="2160" w:type="dxa"/>
-            <w:shd w:val="clear" w:color="auto" w:fill="F2F2F2"/>
           </w:tcPr>
           <w:p>
             <w:r>
+              <w:lastRenderedPageBreak/>
               <w:t>50 Epochs</w:t>
             </w:r>
           </w:p>
@@ -997,7 +909,6 @@
         <w:tc>
           <w:tcPr>
             <w:tcW w:w="2160" w:type="dxa"/>
-            <w:shd w:val="clear" w:color="auto" w:fill="F2F2F2"/>
           </w:tcPr>
           <w:p>
             <w:r>
@@ -1008,7 +919,6 @@
         <w:tc>
           <w:tcPr>
             <w:tcW w:w="2160" w:type="dxa"/>
-            <w:shd w:val="clear" w:color="auto" w:fill="F2F2F2"/>
           </w:tcPr>
           <w:p>
             <w:r>
@@ -1019,7 +929,6 @@
         <w:tc>
           <w:tcPr>
             <w:tcW w:w="2160" w:type="dxa"/>
-            <w:shd w:val="clear" w:color="auto" w:fill="F2F2F2"/>
           </w:tcPr>
           <w:p>
             <w:r>
@@ -1032,8 +941,133 @@
     <w:p>
       <w:pPr>
         <w:pStyle w:val="Heading2"/>
+        <w:rPr>
+          <w:color w:val="auto"/>
+        </w:rPr>
       </w:pPr>
       <w:r>
+        <w:rPr>
+          <w:noProof/>
+        </w:rPr>
+        <w:drawing>
+          <wp:inline distT="0" distB="0" distL="0" distR="0" wp14:anchorId="174115C1" wp14:editId="73C4222B">
+            <wp:extent cx="5486400" cy="1934210"/>
+            <wp:effectExtent l="0" t="0" r="0" b="8890"/>
+            <wp:docPr id="1273145794" name="Picture 1"/>
+            <wp:cNvGraphicFramePr>
+              <a:graphicFrameLocks xmlns:a="http://schemas.openxmlformats.org/drawingml/2006/main" noChangeAspect="1"/>
+            </wp:cNvGraphicFramePr>
+            <a:graphic xmlns:a="http://schemas.openxmlformats.org/drawingml/2006/main">
+              <a:graphicData uri="http://schemas.openxmlformats.org/drawingml/2006/picture">
+                <pic:pic xmlns:pic="http://schemas.openxmlformats.org/drawingml/2006/picture">
+                  <pic:nvPicPr>
+                    <pic:cNvPr id="0" name="Picture 1"/>
+                    <pic:cNvPicPr>
+                      <a:picLocks noChangeAspect="1" noChangeArrowheads="1"/>
+                    </pic:cNvPicPr>
+                  </pic:nvPicPr>
+                  <pic:blipFill>
+                    <a:blip r:embed="rId6">
+                      <a:extLst>
+                        <a:ext uri="{28A0092B-C50C-407E-A947-70E740481C1C}">
+                          <a14:useLocalDpi xmlns:a14="http://schemas.microsoft.com/office/drawing/2010/main" val="0"/>
+                        </a:ext>
+                      </a:extLst>
+                    </a:blip>
+                    <a:srcRect/>
+                    <a:stretch>
+                      <a:fillRect/>
+                    </a:stretch>
+                  </pic:blipFill>
+                  <pic:spPr bwMode="auto">
+                    <a:xfrm>
+                      <a:off x="0" y="0"/>
+                      <a:ext cx="5486400" cy="1934210"/>
+                    </a:xfrm>
+                    <a:prstGeom prst="rect">
+                      <a:avLst/>
+                    </a:prstGeom>
+                    <a:noFill/>
+                    <a:ln>
+                      <a:noFill/>
+                    </a:ln>
+                  </pic:spPr>
+                </pic:pic>
+              </a:graphicData>
+            </a:graphic>
+          </wp:inline>
+        </w:drawing>
+      </w:r>
+    </w:p>
+    <w:p>
+      <w:pPr>
+        <w:jc w:val="center"/>
+      </w:pPr>
+      <w:r>
+        <w:rPr>
+          <w:noProof/>
+        </w:rPr>
+        <w:drawing>
+          <wp:inline distT="0" distB="0" distL="0" distR="0" wp14:anchorId="2A911061" wp14:editId="14574D39">
+            <wp:extent cx="3346938" cy="2772845"/>
+            <wp:effectExtent l="0" t="0" r="6350" b="8890"/>
+            <wp:docPr id="1040072609" name="Picture 2"/>
+            <wp:cNvGraphicFramePr>
+              <a:graphicFrameLocks xmlns:a="http://schemas.openxmlformats.org/drawingml/2006/main" noChangeAspect="1"/>
+            </wp:cNvGraphicFramePr>
+            <a:graphic xmlns:a="http://schemas.openxmlformats.org/drawingml/2006/main">
+              <a:graphicData uri="http://schemas.openxmlformats.org/drawingml/2006/picture">
+                <pic:pic xmlns:pic="http://schemas.openxmlformats.org/drawingml/2006/picture">
+                  <pic:nvPicPr>
+                    <pic:cNvPr id="0" name="Picture 3"/>
+                    <pic:cNvPicPr>
+                      <a:picLocks noChangeAspect="1" noChangeArrowheads="1"/>
+                    </pic:cNvPicPr>
+                  </pic:nvPicPr>
+                  <pic:blipFill>
+                    <a:blip r:embed="rId7">
+                      <a:extLst>
+                        <a:ext uri="{28A0092B-C50C-407E-A947-70E740481C1C}">
+                          <a14:useLocalDpi xmlns:a14="http://schemas.microsoft.com/office/drawing/2010/main" val="0"/>
+                        </a:ext>
+                      </a:extLst>
+                    </a:blip>
+                    <a:srcRect/>
+                    <a:stretch>
+                      <a:fillRect/>
+                    </a:stretch>
+                  </pic:blipFill>
+                  <pic:spPr bwMode="auto">
+                    <a:xfrm>
+                      <a:off x="0" y="0"/>
+                      <a:ext cx="3352072" cy="2777099"/>
+                    </a:xfrm>
+                    <a:prstGeom prst="rect">
+                      <a:avLst/>
+                    </a:prstGeom>
+                    <a:noFill/>
+                    <a:ln>
+                      <a:noFill/>
+                    </a:ln>
+                  </pic:spPr>
+                </pic:pic>
+              </a:graphicData>
+            </a:graphic>
+          </wp:inline>
+        </w:drawing>
+      </w:r>
+    </w:p>
+    <w:p>
+      <w:pPr>
+        <w:pStyle w:val="Heading2"/>
+        <w:rPr>
+          <w:color w:val="auto"/>
+        </w:rPr>
+      </w:pPr>
+      <w:r>
+        <w:rPr>
+          <w:color w:val="auto"/>
+        </w:rPr>
         <w:t>5. Conclusions</w:t>
       </w:r>
     </w:p>
@@ -1870,6 +1904,7 @@
   <w:style w:type="character" w:default="1" w:styleId="DefaultParagraphFont">
     <w:name w:val="Default Paragraph Font"/>
     <w:uiPriority w:val="1"/>
+    <w:semiHidden/>
     <w:unhideWhenUsed/>
   </w:style>
   <w:style w:type="table" w:default="1" w:styleId="TableNormal">

</xml_diff>